<commit_message>
Solar Blog rhetoric discussion
</commit_message>
<xml_diff>
--- a/weekly_files/14  report and final site/Website Report for WDD130 week 14.docx
+++ b/weekly_files/14  report and final site/Website Report for WDD130 week 14.docx
@@ -3,67 +3,69 @@
 <w:document xmlns:wpc="http://schemas.microsoft.com/office/word/2010/wordprocessingCanvas" xmlns:cx="http://schemas.microsoft.com/office/drawing/2014/chartex" xmlns:cx1="http://schemas.microsoft.com/office/drawing/2015/9/8/chartex" xmlns:cx2="http://schemas.microsoft.com/office/drawing/2015/10/21/chartex" xmlns:cx3="http://schemas.microsoft.com/office/drawing/2016/5/9/chartex" xmlns:cx4="http://schemas.microsoft.com/office/drawing/2016/5/10/chartex" xmlns:cx5="http://schemas.microsoft.com/office/drawing/2016/5/11/chartex" xmlns:cx6="http://schemas.microsoft.com/office/drawing/2016/5/12/chartex" xmlns:cx7="http://schemas.microsoft.com/office/drawing/2016/5/13/chartex" xmlns:cx8="http://schemas.microsoft.com/office/drawing/2016/5/14/chartex" xmlns:mc="http://schemas.openxmlformats.org/markup-compatibility/2006" xmlns:aink="http://schemas.microsoft.com/office/drawing/2016/ink" xmlns:am3d="http://schemas.microsoft.com/office/drawing/2017/model3d" xmlns:o="urn:schemas-microsoft-com:office:office" xmlns:oel="http://schemas.microsoft.com/office/2019/extlst" xmlns:r="http://schemas.openxmlformats.org/officeDocument/2006/relationships" xmlns:m="http://schemas.openxmlformats.org/officeDocument/2006/math" xmlns:v="urn:schemas-microsoft-com:vml" xmlns:wp14="http://schemas.microsoft.com/office/word/2010/wordprocessingDrawing" xmlns:wp="http://schemas.openxmlformats.org/drawingml/2006/wordprocessingDrawing" xmlns:w10="urn:schemas-microsoft-com:office:word" xmlns:w="http://schemas.openxmlformats.org/wordprocessingml/2006/main" xmlns:w14="http://schemas.microsoft.com/office/word/2010/wordml" xmlns:w15="http://schemas.microsoft.com/office/word/2012/wordml" xmlns:w16cex="http://schemas.microsoft.com/office/word/2018/wordml/cex" xmlns:w16cid="http://schemas.microsoft.com/office/word/2016/wordml/cid" xmlns:w16="http://schemas.microsoft.com/office/word/2018/wordml" xmlns:w16du="http://schemas.microsoft.com/office/word/2023/wordml/word16du" xmlns:w16sdtdh="http://schemas.microsoft.com/office/word/2020/wordml/sdtdatahash" xmlns:w16sdtfl="http://schemas.microsoft.com/office/word/2024/wordml/sdtformatlock" xmlns:w16se="http://schemas.microsoft.com/office/word/2015/wordml/symex" xmlns:wpg="http://schemas.microsoft.com/office/word/2010/wordprocessingGroup" xmlns:wpi="http://schemas.microsoft.com/office/word/2010/wordprocessingInk" xmlns:wne="http://schemas.microsoft.com/office/word/2006/wordml" xmlns:wps="http://schemas.microsoft.com/office/word/2010/wordprocessingShape" mc:Ignorable="w14 w15 w16se w16cid w16 w16cex w16sdtdh w16sdtfl w16du wp14">
   <w:body>
     <w:p>
-      <w:r>
-        <w:t xml:space="preserve">Name: Mark Ketring  </w:t>
-      </w:r>
-    </w:p>
-    <w:p>
-      <w:r>
-        <w:t xml:space="preserve">Class: WDD 130 </w:t>
-      </w:r>
-      <w:r>
-        <w:rPr>
-          <w:rFonts w:hint="cs"/>
-        </w:rPr>
-        <w:t>–</w:t>
-      </w:r>
-      <w:r>
-        <w:t xml:space="preserve"> Web Fundamentals  </w:t>
-      </w:r>
-    </w:p>
-    <w:p>
-      <w:r>
-        <w:t xml:space="preserve">Date: July 2025  </w:t>
-      </w:r>
-    </w:p>
-    <w:p>
-      <w:pPr>
-        <w:rPr>
-          <w:b/>
-          <w:bCs/>
-        </w:rPr>
-      </w:pPr>
-      <w:r>
-        <w:rPr>
-          <w:b/>
-          <w:bCs/>
-        </w:rPr>
-        <w:t>Title Page</w:t>
-      </w:r>
-    </w:p>
-    <w:p>
-      <w:r>
-        <w:rPr>
-          <w:b/>
-          <w:bCs/>
-        </w:rPr>
-        <w:t xml:space="preserve">Limp Grid </w:t>
-      </w:r>
-      <w:proofErr w:type="gramStart"/>
-      <w:r>
-        <w:rPr>
-          <w:b/>
-          <w:bCs/>
-        </w:rPr>
-        <w:t>A</w:t>
-      </w:r>
-      <w:proofErr w:type="gramEnd"/>
-      <w:r>
-        <w:rPr>
-          <w:b/>
-          <w:bCs/>
-        </w:rPr>
-        <w:t xml:space="preserve"> Solar Reality Check</w:t>
+      <w:pPr>
+        <w:rPr>
+          <w:b/>
+          <w:bCs/>
+        </w:rPr>
+      </w:pPr>
+      <w:r>
+        <w:rPr>
+          <w:b/>
+          <w:bCs/>
+        </w:rPr>
+        <w:t>Limp Grid</w:t>
+      </w:r>
+      <w:r>
+        <w:rPr>
+          <w:b/>
+          <w:bCs/>
+        </w:rPr>
+        <w:t xml:space="preserve"> Energy</w:t>
+      </w:r>
+      <w:r>
+        <w:rPr>
+          <w:b/>
+          <w:bCs/>
+        </w:rPr>
+        <w:t>:</w:t>
+      </w:r>
+      <w:r>
+        <w:rPr>
+          <w:b/>
+          <w:bCs/>
+        </w:rPr>
+        <w:t xml:space="preserve"> A Solar Reality Chec</w:t>
+      </w:r>
+      <w:r>
+        <w:rPr>
+          <w:b/>
+          <w:bCs/>
+        </w:rPr>
+        <w:t xml:space="preserve">k for Arizona Solar </w:t>
+      </w:r>
+      <w:r>
+        <w:rPr>
+          <w:b/>
+          <w:bCs/>
+        </w:rPr>
+        <w:t>Utility Customers</w:t>
+      </w:r>
+    </w:p>
+    <w:p>
+      <w:r>
+        <w:rPr>
+          <w:b/>
+          <w:bCs/>
+        </w:rPr>
+        <w:t>M</w:t>
+      </w:r>
+      <w:r>
+        <w:rPr>
+          <w:b/>
+          <w:bCs/>
+        </w:rPr>
+        <w:t>ark Ketring</w:t>
       </w:r>
       <w:r>
         <w:t xml:space="preserve"> </w:t>
@@ -73,7 +75,7 @@
           <w:b/>
           <w:bCs/>
         </w:rPr>
-        <w:t>Mark Ketring</w:t>
+        <w:t>WDD 130 – Web Fundamentals</w:t>
       </w:r>
       <w:r>
         <w:t xml:space="preserve"> </w:t>
@@ -83,16 +85,6 @@
           <w:b/>
           <w:bCs/>
         </w:rPr>
-        <w:t>WDD 130 – Web Fundamentals</w:t>
-      </w:r>
-      <w:r>
-        <w:t xml:space="preserve"> </w:t>
-      </w:r>
-      <w:r>
-        <w:rPr>
-          <w:b/>
-          <w:bCs/>
-        </w:rPr>
         <w:t>July 2025</w:t>
       </w:r>
     </w:p>
@@ -119,15 +111,11 @@
         <w:t>-</w:t>
       </w:r>
       <w:r>
-        <w:t xml:space="preserve">130 is </w:t>
-      </w:r>
-      <w:proofErr w:type="spellStart"/>
-      <w:proofErr w:type="gramStart"/>
-      <w:r>
-        <w:t>a</w:t>
-      </w:r>
-      <w:proofErr w:type="spellEnd"/>
-      <w:proofErr w:type="gramEnd"/>
+        <w:t>130 is a</w:t>
+      </w:r>
+      <w:r>
+        <w:t>n</w:t>
+      </w:r>
       <w:r>
         <w:t xml:space="preserve"> </w:t>
       </w:r>
@@ -145,15 +133,18 @@
         <w:t>Limp Grid</w:t>
       </w:r>
       <w:r>
+        <w:rPr>
+          <w:i/>
+          <w:iCs/>
+        </w:rPr>
+        <w:t xml:space="preserve"> Energy</w:t>
+      </w:r>
+      <w:r>
         <w:t xml:space="preserve">, which explores the intersection of solar energy, regulatory policy, </w:t>
       </w:r>
-      <w:proofErr w:type="spellStart"/>
-      <w:proofErr w:type="gramStart"/>
       <w:r>
         <w:t>profesional</w:t>
       </w:r>
-      <w:proofErr w:type="spellEnd"/>
-      <w:proofErr w:type="gramEnd"/>
       <w:r>
         <w:t xml:space="preserve"> experience. The site is designed to educate, provoke thought, and share my journey as both a</w:t>
       </w:r>
@@ -244,15 +235,7 @@
         <w:t>, as well as</w:t>
       </w:r>
       <w:r>
-        <w:t xml:space="preserve"> the major unregulated producer-provider </w:t>
-      </w:r>
-      <w:proofErr w:type="gramStart"/>
-      <w:r>
-        <w:t>know</w:t>
-      </w:r>
-      <w:proofErr w:type="gramEnd"/>
-      <w:r>
-        <w:t xml:space="preserve"> as SRP.</w:t>
+        <w:t xml:space="preserve"> the major unregulated producer-provider know as SRP.</w:t>
       </w:r>
     </w:p>
     <w:p>
@@ -410,13 +393,8 @@
         <w:t xml:space="preserve">Educate </w:t>
       </w:r>
       <w:r>
-        <w:t xml:space="preserve">potential </w:t>
-      </w:r>
-      <w:proofErr w:type="spellStart"/>
-      <w:r>
-        <w:t>adoters</w:t>
-      </w:r>
-      <w:proofErr w:type="spellEnd"/>
+        <w:t>potential adoters</w:t>
+      </w:r>
       <w:r>
         <w:t xml:space="preserve"> about Arizona’s solar regulatory history</w:t>
       </w:r>
@@ -429,7 +407,6 @@
         </w:numPr>
       </w:pPr>
       <w:r>
-        <w:lastRenderedPageBreak/>
         <w:t xml:space="preserve">Relate </w:t>
       </w:r>
       <w:r>
@@ -439,26 +416,10 @@
         <w:t>explanations</w:t>
       </w:r>
       <w:r>
-        <w:t xml:space="preserve"> and </w:t>
-      </w:r>
-      <w:proofErr w:type="gramStart"/>
-      <w:r>
-        <w:t>to highlight</w:t>
-      </w:r>
-      <w:proofErr w:type="gramEnd"/>
-      <w:r>
-        <w:t xml:space="preserve"> the challenges of navigating utility rate plans</w:t>
-      </w:r>
-      <w:r>
-        <w:t xml:space="preserve"> and </w:t>
-      </w:r>
-      <w:proofErr w:type="gramStart"/>
-      <w:r>
-        <w:t>future plans</w:t>
-      </w:r>
-      <w:proofErr w:type="gramEnd"/>
-      <w:r>
-        <w:t>.</w:t>
+        <w:t xml:space="preserve"> and to highlight the challenges of navigating utility rate plans</w:t>
+      </w:r>
+      <w:r>
+        <w:t xml:space="preserve"> and future plans.</w:t>
       </w:r>
     </w:p>
     <w:p>
@@ -480,6 +441,7 @@
         </w:numPr>
       </w:pPr>
       <w:r>
+        <w:lastRenderedPageBreak/>
         <w:t>Build a</w:t>
       </w:r>
       <w:r>
@@ -530,80 +492,72 @@
         <w:t xml:space="preserve"> for others </w:t>
       </w:r>
       <w:r>
-        <w:t xml:space="preserve">to get </w:t>
-      </w:r>
-      <w:proofErr w:type="gramStart"/>
-      <w:r>
-        <w:t>an</w:t>
-      </w:r>
-      <w:proofErr w:type="gramEnd"/>
+        <w:t xml:space="preserve">to get an </w:t>
+      </w:r>
+      <w:r>
+        <w:t xml:space="preserve">realistic </w:t>
+      </w:r>
+      <w:r>
+        <w:t>offset view of</w:t>
+      </w:r>
+      <w:r>
+        <w:t xml:space="preserve"> solar energy</w:t>
+      </w:r>
+      <w:r>
+        <w:t xml:space="preserve"> challenges</w:t>
+      </w:r>
+      <w:r>
+        <w:t xml:space="preserve"> in Arizona.</w:t>
+      </w:r>
+      <w:r>
+        <w:t xml:space="preserve"> Most sales consultants avoid frank and honest </w:t>
+      </w:r>
+      <w:r>
+        <w:t>information exchange</w:t>
+      </w:r>
+      <w:r>
+        <w:t xml:space="preserve"> as they</w:t>
+      </w:r>
+      <w:r>
+        <w:t xml:space="preserve"> normally hold back or divert</w:t>
+      </w:r>
+      <w:r>
+        <w:t xml:space="preserve"> consumer</w:t>
+      </w:r>
       <w:r>
         <w:t xml:space="preserve"> </w:t>
       </w:r>
       <w:r>
-        <w:t xml:space="preserve">realistic </w:t>
-      </w:r>
-      <w:r>
-        <w:t>offset view of</w:t>
-      </w:r>
-      <w:r>
-        <w:t xml:space="preserve"> solar energy</w:t>
-      </w:r>
-      <w:r>
-        <w:t xml:space="preserve"> challenges</w:t>
-      </w:r>
-      <w:r>
-        <w:t xml:space="preserve"> in Arizona.</w:t>
-      </w:r>
-      <w:r>
-        <w:t xml:space="preserve"> Most sales consultants avoid frank and honest </w:t>
-      </w:r>
-      <w:r>
-        <w:t>information exchange</w:t>
-      </w:r>
-      <w:r>
-        <w:t xml:space="preserve"> as they</w:t>
-      </w:r>
-      <w:r>
-        <w:t xml:space="preserve"> normally hold back or divert</w:t>
-      </w:r>
-      <w:r>
-        <w:t xml:space="preserve"> consumer</w:t>
+        <w:t>question</w:t>
+      </w:r>
+      <w:r>
+        <w:t xml:space="preserve">s </w:t>
+      </w:r>
+      <w:r>
+        <w:t xml:space="preserve">and </w:t>
+      </w:r>
+      <w:r>
+        <w:t>att</w:t>
+      </w:r>
+      <w:r>
+        <w:t>ention</w:t>
+      </w:r>
+      <w:r>
+        <w:t xml:space="preserve"> away from </w:t>
+      </w:r>
+      <w:r>
+        <w:t xml:space="preserve">conflicted </w:t>
+      </w:r>
+      <w:r>
+        <w:t xml:space="preserve">issues that </w:t>
+      </w:r>
+      <w:r>
+        <w:t>might</w:t>
       </w:r>
       <w:r>
         <w:t xml:space="preserve"> </w:t>
       </w:r>
       <w:r>
-        <w:t>question</w:t>
-      </w:r>
-      <w:r>
-        <w:t xml:space="preserve">s </w:t>
-      </w:r>
-      <w:r>
-        <w:t xml:space="preserve">and </w:t>
-      </w:r>
-      <w:r>
-        <w:t>att</w:t>
-      </w:r>
-      <w:r>
-        <w:t>ention</w:t>
-      </w:r>
-      <w:r>
-        <w:t xml:space="preserve"> away from </w:t>
-      </w:r>
-      <w:r>
-        <w:t xml:space="preserve">conflicted </w:t>
-      </w:r>
-      <w:r>
-        <w:t xml:space="preserve">issues that </w:t>
-      </w:r>
-      <w:r>
-        <w:t>might</w:t>
-      </w:r>
-      <w:r>
-        <w:t xml:space="preserve"> </w:t>
-      </w:r>
-      <w:r>
         <w:t>scuttle a sale.</w:t>
       </w:r>
     </w:p>
@@ -679,36 +633,12 @@
     </w:p>
     <w:p>
       <w:r>
-        <w:t xml:space="preserve">The solar policy timeline was the most content-rich section. I structured it using semantic HTML headings and </w:t>
-      </w:r>
-      <w:proofErr w:type="gramStart"/>
-      <w:r>
-        <w:t>paragraphs, and</w:t>
-      </w:r>
-      <w:proofErr w:type="gramEnd"/>
-      <w:r>
-        <w:t xml:space="preserve"> added </w:t>
-      </w:r>
-      <w:proofErr w:type="gramStart"/>
-      <w:r>
-        <w:t>bolded</w:t>
-      </w:r>
-      <w:proofErr w:type="gramEnd"/>
-      <w:r>
-        <w:t xml:space="preserve"> commentary and inline humor to make the regulatory history more digestible. I also included a call-to-action linking to a solar ROI calculator, reinforcing the site’s practical value.</w:t>
-      </w:r>
-    </w:p>
-    <w:p>
-      <w:r>
-        <w:t xml:space="preserve">One major design decision was to embrace a narrative tone—mixing technical facts with personal commentary. This gave the site a unique voice and helped differentiate it from generic solar info pages. I also resolved image path issues by switching to relative paths and </w:t>
-      </w:r>
-      <w:proofErr w:type="gramStart"/>
-      <w:r>
-        <w:t>validated</w:t>
-      </w:r>
-      <w:proofErr w:type="gramEnd"/>
-      <w:r>
-        <w:t xml:space="preserve"> all HTML and CSS for clean deployment.</w:t>
+        <w:t>The solar policy timeline was the most content-rich section. I structured it using semantic HTML headings and paragraphs, and added bolded commentary and inline humor to make the regulatory history more digestible. I also included a call-to-action linking to a solar ROI calculator, reinforcing the site’s practical value.</w:t>
+      </w:r>
+    </w:p>
+    <w:p>
+      <w:r>
+        <w:t>One major design decision was to embrace a narrative tone—mixing technical facts with personal commentary. This gave the site a unique voice and helped differentiate it from generic solar info pages. I also resolved image path issues by switching to relative paths and validated all HTML and CSS for clean deployment.</w:t>
       </w:r>
     </w:p>
     <w:p>
@@ -733,19 +663,7 @@
     </w:p>
     <w:p>
       <w:r>
-        <w:t xml:space="preserve">These skills will serve me well in future </w:t>
-      </w:r>
-      <w:proofErr w:type="gramStart"/>
-      <w:r>
-        <w:t>projects—</w:t>
-      </w:r>
-      <w:proofErr w:type="gramEnd"/>
-      <w:r>
-        <w:t xml:space="preserve">whether I’m building tools for my solar design team, creating educational content for consumers, or launching a new initiative to </w:t>
-      </w:r>
-      <w:r>
-        <w:lastRenderedPageBreak/>
-        <w:t xml:space="preserve">challenge outdated energy policies. </w:t>
+        <w:t xml:space="preserve">These skills will serve me well in future projects—whether I’m building tools for my solar design team, creating educational content for consumers, or launching a new initiative to challenge outdated energy policies. </w:t>
       </w:r>
       <w:r>
         <w:rPr>
@@ -854,6 +772,7 @@
     <w:p/>
     <w:p>
       <w:r>
+        <w:lastRenderedPageBreak/>
         <w:t>My primary goal with this website was to create a clean, responsive, and informative platform that reflects both my technical background and my creative interests. I wanted to demonstrate proficiency in HTML and CSS, while also telling a compelling story about who I am and what I do. I hoped to accomplish the following:</w:t>
       </w:r>
     </w:p>
@@ -928,8 +847,41 @@
     <w:p/>
     <w:p>
       <w:r>
+        <w:t>The solar subpage required more research and content development. I created a horizontal infographic timeline to explain Arizona</w:t>
+      </w:r>
+      <w:r>
+        <w:rPr>
+          <w:rFonts w:hint="cs"/>
+        </w:rPr>
+        <w:t>’</w:t>
+      </w:r>
+      <w:r>
+        <w:t>s solar regulatory history and utility rate plans. I also used tables and hover animations to make the data more interactive and digestible.</w:t>
+      </w:r>
+    </w:p>
+    <w:p/>
+    <w:p>
+      <w:r>
         <w:lastRenderedPageBreak/>
-        <w:t>The solar subpage required more research and content development. I created a horizontal infographic timeline to explain Arizona</w:t>
+        <w:t>One major change I made during development was switching from root-relative image paths to relative paths, which resolved issues with image loading in Live Server. I also consolidated my CSS into a single stylesheet for better maintainability.</w:t>
+      </w:r>
+    </w:p>
+    <w:p/>
+    <w:p>
+      <w:r>
+        <w:t>---</w:t>
+      </w:r>
+    </w:p>
+    <w:p/>
+    <w:p>
+      <w:r>
+        <w:t>**Conclusion**</w:t>
+      </w:r>
+    </w:p>
+    <w:p/>
+    <w:p>
+      <w:r>
+        <w:t>Completing this project has been both challenging and rewarding. I</w:t>
       </w:r>
       <w:r>
         <w:rPr>
@@ -938,71 +890,22 @@
         <w:t>’</w:t>
       </w:r>
       <w:r>
-        <w:t>s solar regulatory history and utility rate plans. I also used tables and hover animations to make the data more interactive and digestible.</w:t>
+        <w:t>ve learned how to structure a website from scratch, how to troubleshoot layout and path issues, and how to use CSS to create responsive, visually appealing designs. I</w:t>
+      </w:r>
+      <w:r>
+        <w:rPr>
+          <w:rFonts w:hint="cs"/>
+        </w:rPr>
+        <w:t>’</w:t>
+      </w:r>
+      <w:r>
+        <w:t>ve also gained experience with GitHub Pages and the importance of validating code for accessibility and performance.</w:t>
       </w:r>
     </w:p>
     <w:p/>
     <w:p>
       <w:r>
-        <w:t xml:space="preserve">One major change I made during development was switching from root-relative image paths to relative paths, which resolved issues with image loading in Live Server. I also consolidated my CSS into a single </w:t>
-      </w:r>
-      <w:proofErr w:type="gramStart"/>
-      <w:r>
-        <w:t>stylesheet</w:t>
-      </w:r>
-      <w:proofErr w:type="gramEnd"/>
-      <w:r>
-        <w:t xml:space="preserve"> for better maintainability.</w:t>
-      </w:r>
-    </w:p>
-    <w:p/>
-    <w:p>
-      <w:r>
-        <w:t>---</w:t>
-      </w:r>
-    </w:p>
-    <w:p/>
-    <w:p>
-      <w:r>
-        <w:t>**Conclusion**</w:t>
-      </w:r>
-    </w:p>
-    <w:p/>
-    <w:p>
-      <w:r>
-        <w:t>Completing this project has been both challenging and rewarding. I</w:t>
-      </w:r>
-      <w:r>
-        <w:rPr>
-          <w:rFonts w:hint="cs"/>
-        </w:rPr>
-        <w:t>’</w:t>
-      </w:r>
-      <w:r>
-        <w:t>ve learned how to structure a website from scratch, how to troubleshoot layout and path issues, and how to use CSS to create responsive, visually appealing designs. I</w:t>
-      </w:r>
-      <w:r>
-        <w:rPr>
-          <w:rFonts w:hint="cs"/>
-        </w:rPr>
-        <w:t>’</w:t>
-      </w:r>
-      <w:r>
-        <w:t>ve also gained experience with GitHub Pages and the importance of validating code for accessibility and performance.</w:t>
-      </w:r>
-    </w:p>
-    <w:p/>
-    <w:p>
-      <w:r>
-        <w:t xml:space="preserve">These skills will be invaluable as I continue to explore web development and integrate </w:t>
-      </w:r>
-      <w:proofErr w:type="gramStart"/>
-      <w:r>
-        <w:t>it</w:t>
-      </w:r>
-      <w:proofErr w:type="gramEnd"/>
-      <w:r>
-        <w:t xml:space="preserve"> into my work in renewable energy. Whether I</w:t>
+        <w:t>These skills will be invaluable as I continue to explore web development and integrate it into my work in renewable energy. Whether I</w:t>
       </w:r>
       <w:r>
         <w:rPr>
@@ -1018,15 +921,7 @@
     <w:p/>
     <w:p>
       <w:r>
-        <w:t xml:space="preserve">For this part of the project, you are required to type a final report using Word or PDF, detailing the design and development of your </w:t>
-      </w:r>
-      <w:proofErr w:type="gramStart"/>
-      <w:r>
-        <w:t>completed</w:t>
-      </w:r>
-      <w:proofErr w:type="gramEnd"/>
-      <w:r>
-        <w:t xml:space="preserve"> website. Your report must be at least 500 words.</w:t>
+        <w:t>For this part of the project, you are required to type a final report using Word or PDF, detailing the design and development of your completed website. Your report must be at least 500 words.</w:t>
       </w:r>
     </w:p>
     <w:p>
@@ -1062,13 +957,8 @@
           <w:numId w:val="1"/>
         </w:numPr>
       </w:pPr>
-      <w:proofErr w:type="gramStart"/>
-      <w:r>
-        <w:t>Introduce</w:t>
-      </w:r>
-      <w:proofErr w:type="gramEnd"/>
-      <w:r>
-        <w:t xml:space="preserve"> the subject of your website.</w:t>
+      <w:r>
+        <w:t>Introduce the subject of your website.</w:t>
       </w:r>
     </w:p>
     <w:p>
@@ -1090,16 +980,7 @@
         </w:numPr>
       </w:pPr>
       <w:r>
-        <w:lastRenderedPageBreak/>
-        <w:t xml:space="preserve">Include the URL for your </w:t>
-      </w:r>
-      <w:proofErr w:type="gramStart"/>
-      <w:r>
-        <w:t>completed</w:t>
-      </w:r>
-      <w:proofErr w:type="gramEnd"/>
-      <w:r>
-        <w:t xml:space="preserve"> website.</w:t>
+        <w:t>Include the URL for your completed website.</w:t>
       </w:r>
     </w:p>
     <w:p>
@@ -1140,6 +1021,7 @@
           <w:b/>
           <w:bCs/>
         </w:rPr>
+        <w:lastRenderedPageBreak/>
         <w:t>Design Process (5 pts)</w:t>
       </w:r>
     </w:p>

</xml_diff>